<commit_message>
Fix thesis citation placement
</commit_message>
<xml_diff>
--- a/docs/ВКР_Ускорение неточного поиска в БД на основе вероятностных соотношений_Полещук И.В..docx
+++ b/docs/ВКР_Ускорение неточного поиска в БД на основе вероятностных соотношений_Полещук И.В..docx
@@ -71,7 +71,7 @@
           <w:r>
             <w:fldChar w:fldCharType="separate"/>
           </w:r>
-          <w:hyperlink w:anchor="_Toc231917331" w:history="1">
+          <w:hyperlink w:anchor="_Toc231917834" w:history="1">
             <w:r>
               <w:rPr>
                 <w:rStyle w:val="ab"/>
@@ -98,7 +98,7 @@
                 <w:noProof/>
                 <w:webHidden/>
               </w:rPr>
-              <w:instrText xml:space="preserve"> PAGEREF _Toc231917331 \h </w:instrText>
+              <w:instrText xml:space="preserve"> PAGEREF _Toc231917834 \h </w:instrText>
             </w:r>
             <w:r>
               <w:rPr>
@@ -145,7 +145,7 @@
               <w14:ligatures w14:val="standardContextual"/>
             </w:rPr>
           </w:pPr>
-          <w:hyperlink w:anchor="_Toc231917332" w:history="1">
+          <w:hyperlink w:anchor="_Toc231917835" w:history="1">
             <w:r>
               <w:rPr>
                 <w:rStyle w:val="ab"/>
@@ -172,7 +172,7 @@
                 <w:noProof/>
                 <w:webHidden/>
               </w:rPr>
-              <w:instrText xml:space="preserve"> PAGEREF _Toc231917332 \h </w:instrText>
+              <w:instrText xml:space="preserve"> PAGEREF _Toc231917835 \h </w:instrText>
             </w:r>
             <w:r>
               <w:rPr>
@@ -220,7 +220,7 @@
               <w14:ligatures w14:val="standardContextual"/>
             </w:rPr>
           </w:pPr>
-          <w:hyperlink w:anchor="_Toc231917333" w:history="1">
+          <w:hyperlink w:anchor="_Toc231917836" w:history="1">
             <w:r>
               <w:rPr>
                 <w:rStyle w:val="ab"/>
@@ -266,7 +266,7 @@
                 <w:noProof/>
                 <w:webHidden/>
               </w:rPr>
-              <w:instrText xml:space="preserve"> PAGEREF _Toc231917333 \h </w:instrText>
+              <w:instrText xml:space="preserve"> PAGEREF _Toc231917836 \h </w:instrText>
             </w:r>
             <w:r>
               <w:rPr>
@@ -310,7 +310,7 @@
               <w14:ligatures w14:val="standardContextual"/>
             </w:rPr>
           </w:pPr>
-          <w:hyperlink w:anchor="_Toc231917334" w:history="1">
+          <w:hyperlink w:anchor="_Toc231917837" w:history="1">
             <w:r>
               <w:rPr>
                 <w:rStyle w:val="ab"/>
@@ -356,7 +356,7 @@
                 <w:noProof/>
                 <w:webHidden/>
               </w:rPr>
-              <w:instrText xml:space="preserve"> PAGEREF _Toc231917334 \h </w:instrText>
+              <w:instrText xml:space="preserve"> PAGEREF _Toc231917837 \h </w:instrText>
             </w:r>
             <w:r>
               <w:rPr>
@@ -400,7 +400,7 @@
               <w14:ligatures w14:val="standardContextual"/>
             </w:rPr>
           </w:pPr>
-          <w:hyperlink w:anchor="_Toc231917335" w:history="1">
+          <w:hyperlink w:anchor="_Toc231917838" w:history="1">
             <w:r>
               <w:rPr>
                 <w:rStyle w:val="ab"/>
@@ -446,7 +446,7 @@
                 <w:noProof/>
                 <w:webHidden/>
               </w:rPr>
-              <w:instrText xml:space="preserve"> PAGEREF _Toc231917335 \h </w:instrText>
+              <w:instrText xml:space="preserve"> PAGEREF _Toc231917838 \h </w:instrText>
             </w:r>
             <w:r>
               <w:rPr>
@@ -490,7 +490,7 @@
               <w14:ligatures w14:val="standardContextual"/>
             </w:rPr>
           </w:pPr>
-          <w:hyperlink w:anchor="_Toc231917336" w:history="1">
+          <w:hyperlink w:anchor="_Toc231917839" w:history="1">
             <w:r>
               <w:rPr>
                 <w:rStyle w:val="ab"/>
@@ -536,7 +536,7 @@
                 <w:noProof/>
                 <w:webHidden/>
               </w:rPr>
-              <w:instrText xml:space="preserve"> PAGEREF _Toc231917336 \h </w:instrText>
+              <w:instrText xml:space="preserve"> PAGEREF _Toc231917839 \h </w:instrText>
             </w:r>
             <w:r>
               <w:rPr>
@@ -580,7 +580,7 @@
               <w14:ligatures w14:val="standardContextual"/>
             </w:rPr>
           </w:pPr>
-          <w:hyperlink w:anchor="_Toc231917337" w:history="1">
+          <w:hyperlink w:anchor="_Toc231917840" w:history="1">
             <w:r>
               <w:rPr>
                 <w:rStyle w:val="ab"/>
@@ -626,7 +626,7 @@
                 <w:noProof/>
                 <w:webHidden/>
               </w:rPr>
-              <w:instrText xml:space="preserve"> PAGEREF _Toc231917337 \h </w:instrText>
+              <w:instrText xml:space="preserve"> PAGEREF _Toc231917840 \h </w:instrText>
             </w:r>
             <w:r>
               <w:rPr>
@@ -670,7 +670,7 @@
               <w14:ligatures w14:val="standardContextual"/>
             </w:rPr>
           </w:pPr>
-          <w:hyperlink w:anchor="_Toc231917338" w:history="1">
+          <w:hyperlink w:anchor="_Toc231917841" w:history="1">
             <w:r>
               <w:rPr>
                 <w:rStyle w:val="ab"/>
@@ -716,7 +716,7 @@
                 <w:noProof/>
                 <w:webHidden/>
               </w:rPr>
-              <w:instrText xml:space="preserve"> PAGEREF _Toc231917338 \h </w:instrText>
+              <w:instrText xml:space="preserve"> PAGEREF _Toc231917841 \h </w:instrText>
             </w:r>
             <w:r>
               <w:rPr>
@@ -760,7 +760,7 @@
               <w14:ligatures w14:val="standardContextual"/>
             </w:rPr>
           </w:pPr>
-          <w:hyperlink w:anchor="_Toc231917339" w:history="1">
+          <w:hyperlink w:anchor="_Toc231917842" w:history="1">
             <w:r>
               <w:rPr>
                 <w:rStyle w:val="ab"/>
@@ -806,7 +806,7 @@
                 <w:noProof/>
                 <w:webHidden/>
               </w:rPr>
-              <w:instrText xml:space="preserve"> PAGEREF _Toc231917339 \h </w:instrText>
+              <w:instrText xml:space="preserve"> PAGEREF _Toc231917842 \h </w:instrText>
             </w:r>
             <w:r>
               <w:rPr>
@@ -854,7 +854,7 @@
               <w14:ligatures w14:val="standardContextual"/>
             </w:rPr>
           </w:pPr>
-          <w:hyperlink w:anchor="_Toc231917340" w:history="1">
+          <w:hyperlink w:anchor="_Toc231917843" w:history="1">
             <w:r>
               <w:rPr>
                 <w:rStyle w:val="ab"/>
@@ -900,7 +900,7 @@
                 <w:noProof/>
                 <w:webHidden/>
               </w:rPr>
-              <w:instrText xml:space="preserve"> PAGEREF _Toc231917340 \h </w:instrText>
+              <w:instrText xml:space="preserve"> PAGEREF _Toc231917843 \h </w:instrText>
             </w:r>
             <w:r>
               <w:rPr>
@@ -944,7 +944,7 @@
               <w14:ligatures w14:val="standardContextual"/>
             </w:rPr>
           </w:pPr>
-          <w:hyperlink w:anchor="_Toc231917341" w:history="1">
+          <w:hyperlink w:anchor="_Toc231917844" w:history="1">
             <w:r>
               <w:rPr>
                 <w:rStyle w:val="ab"/>
@@ -990,7 +990,7 @@
                 <w:noProof/>
                 <w:webHidden/>
               </w:rPr>
-              <w:instrText xml:space="preserve"> PAGEREF _Toc231917341 \h </w:instrText>
+              <w:instrText xml:space="preserve"> PAGEREF _Toc231917844 \h </w:instrText>
             </w:r>
             <w:r>
               <w:rPr>
@@ -1034,7 +1034,7 @@
               <w14:ligatures w14:val="standardContextual"/>
             </w:rPr>
           </w:pPr>
-          <w:hyperlink w:anchor="_Toc231917342" w:history="1">
+          <w:hyperlink w:anchor="_Toc231917845" w:history="1">
             <w:r>
               <w:rPr>
                 <w:rStyle w:val="ab"/>
@@ -1080,7 +1080,7 @@
                 <w:noProof/>
                 <w:webHidden/>
               </w:rPr>
-              <w:instrText xml:space="preserve"> PAGEREF _Toc231917342 \h </w:instrText>
+              <w:instrText xml:space="preserve"> PAGEREF _Toc231917845 \h </w:instrText>
             </w:r>
             <w:r>
               <w:rPr>
@@ -1124,7 +1124,7 @@
               <w14:ligatures w14:val="standardContextual"/>
             </w:rPr>
           </w:pPr>
-          <w:hyperlink w:anchor="_Toc231917343" w:history="1">
+          <w:hyperlink w:anchor="_Toc231917846" w:history="1">
             <w:r>
               <w:rPr>
                 <w:rStyle w:val="ab"/>
@@ -1170,7 +1170,7 @@
                 <w:noProof/>
                 <w:webHidden/>
               </w:rPr>
-              <w:instrText xml:space="preserve"> PAGEREF _Toc231917343 \h </w:instrText>
+              <w:instrText xml:space="preserve"> PAGEREF _Toc231917846 \h </w:instrText>
             </w:r>
             <w:r>
               <w:rPr>
@@ -1214,7 +1214,7 @@
               <w14:ligatures w14:val="standardContextual"/>
             </w:rPr>
           </w:pPr>
-          <w:hyperlink w:anchor="_Toc231917344" w:history="1">
+          <w:hyperlink w:anchor="_Toc231917847" w:history="1">
             <w:r>
               <w:rPr>
                 <w:rStyle w:val="ab"/>
@@ -1260,7 +1260,7 @@
                 <w:noProof/>
                 <w:webHidden/>
               </w:rPr>
-              <w:instrText xml:space="preserve"> PAGEREF _Toc231917344 \h </w:instrText>
+              <w:instrText xml:space="preserve"> PAGEREF _Toc231917847 \h </w:instrText>
             </w:r>
             <w:r>
               <w:rPr>
@@ -1304,7 +1304,7 @@
               <w14:ligatures w14:val="standardContextual"/>
             </w:rPr>
           </w:pPr>
-          <w:hyperlink w:anchor="_Toc231917345" w:history="1">
+          <w:hyperlink w:anchor="_Toc231917848" w:history="1">
             <w:r>
               <w:rPr>
                 <w:rStyle w:val="ab"/>
@@ -1350,7 +1350,7 @@
                 <w:noProof/>
                 <w:webHidden/>
               </w:rPr>
-              <w:instrText xml:space="preserve"> PAGEREF _Toc231917345 \h </w:instrText>
+              <w:instrText xml:space="preserve"> PAGEREF _Toc231917848 \h </w:instrText>
             </w:r>
             <w:r>
               <w:rPr>
@@ -1394,7 +1394,7 @@
               <w14:ligatures w14:val="standardContextual"/>
             </w:rPr>
           </w:pPr>
-          <w:hyperlink w:anchor="_Toc231917346" w:history="1">
+          <w:hyperlink w:anchor="_Toc231917849" w:history="1">
             <w:r>
               <w:rPr>
                 <w:rStyle w:val="ab"/>
@@ -1440,7 +1440,7 @@
                 <w:noProof/>
                 <w:webHidden/>
               </w:rPr>
-              <w:instrText xml:space="preserve"> PAGEREF _Toc231917346 \h </w:instrText>
+              <w:instrText xml:space="preserve"> PAGEREF _Toc231917849 \h </w:instrText>
             </w:r>
             <w:r>
               <w:rPr>
@@ -1484,7 +1484,7 @@
               <w14:ligatures w14:val="standardContextual"/>
             </w:rPr>
           </w:pPr>
-          <w:hyperlink w:anchor="_Toc231917347" w:history="1">
+          <w:hyperlink w:anchor="_Toc231917850" w:history="1">
             <w:r>
               <w:rPr>
                 <w:rStyle w:val="ab"/>
@@ -1509,7 +1509,7 @@
                 <w:rStyle w:val="ab"/>
                 <w:noProof/>
               </w:rPr>
-              <w:t>Применение метода в задачах кредитного скоринга [18; 19]</w:t>
+              <w:t>Применение метода в задачах кредитного скоринга</w:t>
             </w:r>
             <w:r>
               <w:rPr>
@@ -1530,7 +1530,7 @@
                 <w:noProof/>
                 <w:webHidden/>
               </w:rPr>
-              <w:instrText xml:space="preserve"> PAGEREF _Toc231917347 \h </w:instrText>
+              <w:instrText xml:space="preserve"> PAGEREF _Toc231917850 \h </w:instrText>
             </w:r>
             <w:r>
               <w:rPr>
@@ -1578,7 +1578,7 @@
               <w14:ligatures w14:val="standardContextual"/>
             </w:rPr>
           </w:pPr>
-          <w:hyperlink w:anchor="_Toc231917348" w:history="1">
+          <w:hyperlink w:anchor="_Toc231917851" w:history="1">
             <w:r>
               <w:rPr>
                 <w:rStyle w:val="ab"/>
@@ -1624,7 +1624,7 @@
                 <w:noProof/>
                 <w:webHidden/>
               </w:rPr>
-              <w:instrText xml:space="preserve"> PAGEREF _Toc231917348 \h </w:instrText>
+              <w:instrText xml:space="preserve"> PAGEREF _Toc231917851 \h </w:instrText>
             </w:r>
             <w:r>
               <w:rPr>
@@ -1668,7 +1668,7 @@
               <w14:ligatures w14:val="standardContextual"/>
             </w:rPr>
           </w:pPr>
-          <w:hyperlink w:anchor="_Toc231917349" w:history="1">
+          <w:hyperlink w:anchor="_Toc231917852" w:history="1">
             <w:r>
               <w:rPr>
                 <w:rStyle w:val="ab"/>
@@ -1714,7 +1714,7 @@
                 <w:noProof/>
                 <w:webHidden/>
               </w:rPr>
-              <w:instrText xml:space="preserve"> PAGEREF _Toc231917349 \h </w:instrText>
+              <w:instrText xml:space="preserve"> PAGEREF _Toc231917852 \h </w:instrText>
             </w:r>
             <w:r>
               <w:rPr>
@@ -1758,7 +1758,7 @@
               <w14:ligatures w14:val="standardContextual"/>
             </w:rPr>
           </w:pPr>
-          <w:hyperlink w:anchor="_Toc231917350" w:history="1">
+          <w:hyperlink w:anchor="_Toc231917853" w:history="1">
             <w:r>
               <w:rPr>
                 <w:rStyle w:val="ab"/>
@@ -1804,7 +1804,7 @@
                 <w:noProof/>
                 <w:webHidden/>
               </w:rPr>
-              <w:instrText xml:space="preserve"> PAGEREF _Toc231917350 \h </w:instrText>
+              <w:instrText xml:space="preserve"> PAGEREF _Toc231917853 \h </w:instrText>
             </w:r>
             <w:r>
               <w:rPr>
@@ -1848,7 +1848,7 @@
               <w14:ligatures w14:val="standardContextual"/>
             </w:rPr>
           </w:pPr>
-          <w:hyperlink w:anchor="_Toc231917351" w:history="1">
+          <w:hyperlink w:anchor="_Toc231917854" w:history="1">
             <w:r>
               <w:rPr>
                 <w:rStyle w:val="ab"/>
@@ -1894,7 +1894,7 @@
                 <w:noProof/>
                 <w:webHidden/>
               </w:rPr>
-              <w:instrText xml:space="preserve"> PAGEREF _Toc231917351 \h </w:instrText>
+              <w:instrText xml:space="preserve"> PAGEREF _Toc231917854 \h </w:instrText>
             </w:r>
             <w:r>
               <w:rPr>
@@ -1938,7 +1938,7 @@
               <w14:ligatures w14:val="standardContextual"/>
             </w:rPr>
           </w:pPr>
-          <w:hyperlink w:anchor="_Toc231917352" w:history="1">
+          <w:hyperlink w:anchor="_Toc231917855" w:history="1">
             <w:r>
               <w:rPr>
                 <w:rStyle w:val="ab"/>
@@ -1984,7 +1984,7 @@
                 <w:noProof/>
                 <w:webHidden/>
               </w:rPr>
-              <w:instrText xml:space="preserve"> PAGEREF _Toc231917352 \h </w:instrText>
+              <w:instrText xml:space="preserve"> PAGEREF _Toc231917855 \h </w:instrText>
             </w:r>
             <w:r>
               <w:rPr>
@@ -2028,7 +2028,7 @@
               <w14:ligatures w14:val="standardContextual"/>
             </w:rPr>
           </w:pPr>
-          <w:hyperlink w:anchor="_Toc231917353" w:history="1">
+          <w:hyperlink w:anchor="_Toc231917856" w:history="1">
             <w:r>
               <w:rPr>
                 <w:rStyle w:val="ab"/>
@@ -2074,7 +2074,7 @@
                 <w:noProof/>
                 <w:webHidden/>
               </w:rPr>
-              <w:instrText xml:space="preserve"> PAGEREF _Toc231917353 \h </w:instrText>
+              <w:instrText xml:space="preserve"> PAGEREF _Toc231917856 \h </w:instrText>
             </w:r>
             <w:r>
               <w:rPr>
@@ -2118,7 +2118,7 @@
               <w14:ligatures w14:val="standardContextual"/>
             </w:rPr>
           </w:pPr>
-          <w:hyperlink w:anchor="_Toc231917354" w:history="1">
+          <w:hyperlink w:anchor="_Toc231917857" w:history="1">
             <w:r>
               <w:rPr>
                 <w:rStyle w:val="ab"/>
@@ -2164,7 +2164,7 @@
                 <w:noProof/>
                 <w:webHidden/>
               </w:rPr>
-              <w:instrText xml:space="preserve"> PAGEREF _Toc231917354 \h </w:instrText>
+              <w:instrText xml:space="preserve"> PAGEREF _Toc231917857 \h </w:instrText>
             </w:r>
             <w:r>
               <w:rPr>
@@ -2208,7 +2208,7 @@
               <w14:ligatures w14:val="standardContextual"/>
             </w:rPr>
           </w:pPr>
-          <w:hyperlink w:anchor="_Toc231917355" w:history="1">
+          <w:hyperlink w:anchor="_Toc231917858" w:history="1">
             <w:r>
               <w:rPr>
                 <w:rStyle w:val="ab"/>
@@ -2254,7 +2254,7 @@
                 <w:noProof/>
                 <w:webHidden/>
               </w:rPr>
-              <w:instrText xml:space="preserve"> PAGEREF _Toc231917355 \h </w:instrText>
+              <w:instrText xml:space="preserve"> PAGEREF _Toc231917858 \h </w:instrText>
             </w:r>
             <w:r>
               <w:rPr>
@@ -2301,7 +2301,7 @@
               <w14:ligatures w14:val="standardContextual"/>
             </w:rPr>
           </w:pPr>
-          <w:hyperlink w:anchor="_Toc231917356" w:history="1">
+          <w:hyperlink w:anchor="_Toc231917859" w:history="1">
             <w:r>
               <w:rPr>
                 <w:rStyle w:val="ab"/>
@@ -2328,7 +2328,7 @@
                 <w:noProof/>
                 <w:webHidden/>
               </w:rPr>
-              <w:instrText xml:space="preserve"> PAGEREF _Toc231917356 \h </w:instrText>
+              <w:instrText xml:space="preserve"> PAGEREF _Toc231917859 \h </w:instrText>
             </w:r>
             <w:r>
               <w:rPr>
@@ -2375,7 +2375,7 @@
               <w14:ligatures w14:val="standardContextual"/>
             </w:rPr>
           </w:pPr>
-          <w:hyperlink w:anchor="_Toc231917357" w:history="1">
+          <w:hyperlink w:anchor="_Toc231917860" w:history="1">
             <w:r>
               <w:rPr>
                 <w:rStyle w:val="ab"/>
@@ -2402,7 +2402,7 @@
                 <w:noProof/>
                 <w:webHidden/>
               </w:rPr>
-              <w:instrText xml:space="preserve"> PAGEREF _Toc231917357 \h </w:instrText>
+              <w:instrText xml:space="preserve"> PAGEREF _Toc231917860 \h </w:instrText>
             </w:r>
             <w:r>
               <w:rPr>
@@ -2449,7 +2449,7 @@
               <w14:ligatures w14:val="standardContextual"/>
             </w:rPr>
           </w:pPr>
-          <w:hyperlink w:anchor="_Toc231917358" w:history="1">
+          <w:hyperlink w:anchor="_Toc231917861" w:history="1">
             <w:r>
               <w:rPr>
                 <w:rStyle w:val="ab"/>
@@ -2476,7 +2476,7 @@
                 <w:noProof/>
                 <w:webHidden/>
               </w:rPr>
-              <w:instrText xml:space="preserve"> PAGEREF _Toc231917358 \h </w:instrText>
+              <w:instrText xml:space="preserve"> PAGEREF _Toc231917861 \h </w:instrText>
             </w:r>
             <w:r>
               <w:rPr>
@@ -2520,7 +2520,7 @@
               <w14:ligatures w14:val="standardContextual"/>
             </w:rPr>
           </w:pPr>
-          <w:hyperlink w:anchor="_Toc231917359" w:history="1">
+          <w:hyperlink w:anchor="_Toc231917862" w:history="1">
             <w:r>
               <w:rPr>
                 <w:rStyle w:val="ab"/>
@@ -2547,7 +2547,7 @@
                 <w:noProof/>
                 <w:webHidden/>
               </w:rPr>
-              <w:instrText xml:space="preserve"> PAGEREF _Toc231917359 \h </w:instrText>
+              <w:instrText xml:space="preserve"> PAGEREF _Toc231917862 \h </w:instrText>
             </w:r>
             <w:r>
               <w:rPr>
@@ -2591,7 +2591,7 @@
               <w14:ligatures w14:val="standardContextual"/>
             </w:rPr>
           </w:pPr>
-          <w:hyperlink w:anchor="_Toc231917360" w:history="1">
+          <w:hyperlink w:anchor="_Toc231917863" w:history="1">
             <w:r>
               <w:rPr>
                 <w:rStyle w:val="ab"/>
@@ -2618,7 +2618,7 @@
                 <w:noProof/>
                 <w:webHidden/>
               </w:rPr>
-              <w:instrText xml:space="preserve"> PAGEREF _Toc231917360 \h </w:instrText>
+              <w:instrText xml:space="preserve"> PAGEREF _Toc231917863 \h </w:instrText>
             </w:r>
             <w:r>
               <w:rPr>
@@ -2662,7 +2662,7 @@
               <w14:ligatures w14:val="standardContextual"/>
             </w:rPr>
           </w:pPr>
-          <w:hyperlink w:anchor="_Toc231917361" w:history="1">
+          <w:hyperlink w:anchor="_Toc231917864" w:history="1">
             <w:r>
               <w:rPr>
                 <w:rStyle w:val="ab"/>
@@ -2689,7 +2689,7 @@
                 <w:noProof/>
                 <w:webHidden/>
               </w:rPr>
-              <w:instrText xml:space="preserve"> PAGEREF _Toc231917361 \h </w:instrText>
+              <w:instrText xml:space="preserve"> PAGEREF _Toc231917864 \h </w:instrText>
             </w:r>
             <w:r>
               <w:rPr>
@@ -2733,7 +2733,7 @@
               <w14:ligatures w14:val="standardContextual"/>
             </w:rPr>
           </w:pPr>
-          <w:hyperlink w:anchor="_Toc231917362" w:history="1">
+          <w:hyperlink w:anchor="_Toc231917865" w:history="1">
             <w:r>
               <w:rPr>
                 <w:rStyle w:val="ab"/>
@@ -2760,7 +2760,7 @@
                 <w:noProof/>
                 <w:webHidden/>
               </w:rPr>
-              <w:instrText xml:space="preserve"> PAGEREF _Toc231917362 \h </w:instrText>
+              <w:instrText xml:space="preserve"> PAGEREF _Toc231917865 \h </w:instrText>
             </w:r>
             <w:r>
               <w:rPr>
@@ -2804,7 +2804,7 @@
               <w14:ligatures w14:val="standardContextual"/>
             </w:rPr>
           </w:pPr>
-          <w:hyperlink w:anchor="_Toc231917363" w:history="1">
+          <w:hyperlink w:anchor="_Toc231917866" w:history="1">
             <w:r>
               <w:rPr>
                 <w:rStyle w:val="ab"/>
@@ -2831,7 +2831,7 @@
                 <w:noProof/>
                 <w:webHidden/>
               </w:rPr>
-              <w:instrText xml:space="preserve"> PAGEREF _Toc231917363 \h </w:instrText>
+              <w:instrText xml:space="preserve"> PAGEREF _Toc231917866 \h </w:instrText>
             </w:r>
             <w:r>
               <w:rPr>
@@ -2875,7 +2875,7 @@
               <w14:ligatures w14:val="standardContextual"/>
             </w:rPr>
           </w:pPr>
-          <w:hyperlink w:anchor="_Toc231917364" w:history="1">
+          <w:hyperlink w:anchor="_Toc231917867" w:history="1">
             <w:r>
               <w:rPr>
                 <w:rStyle w:val="ab"/>
@@ -2902,7 +2902,7 @@
                 <w:noProof/>
                 <w:webHidden/>
               </w:rPr>
-              <w:instrText xml:space="preserve"> PAGEREF _Toc231917364 \h </w:instrText>
+              <w:instrText xml:space="preserve"> PAGEREF _Toc231917867 \h </w:instrText>
             </w:r>
             <w:r>
               <w:rPr>
@@ -2946,7 +2946,7 @@
               <w14:ligatures w14:val="standardContextual"/>
             </w:rPr>
           </w:pPr>
-          <w:hyperlink w:anchor="_Toc231917365" w:history="1">
+          <w:hyperlink w:anchor="_Toc231917868" w:history="1">
             <w:r>
               <w:rPr>
                 <w:rStyle w:val="ab"/>
@@ -2973,7 +2973,7 @@
                 <w:noProof/>
                 <w:webHidden/>
               </w:rPr>
-              <w:instrText xml:space="preserve"> PAGEREF _Toc231917365 \h </w:instrText>
+              <w:instrText xml:space="preserve"> PAGEREF _Toc231917868 \h </w:instrText>
             </w:r>
             <w:r>
               <w:rPr>
@@ -3017,7 +3017,7 @@
               <w14:ligatures w14:val="standardContextual"/>
             </w:rPr>
           </w:pPr>
-          <w:hyperlink w:anchor="_Toc231917366" w:history="1">
+          <w:hyperlink w:anchor="_Toc231917869" w:history="1">
             <w:r>
               <w:rPr>
                 <w:rStyle w:val="ab"/>
@@ -3044,7 +3044,7 @@
                 <w:noProof/>
                 <w:webHidden/>
               </w:rPr>
-              <w:instrText xml:space="preserve"> PAGEREF _Toc231917366 \h </w:instrText>
+              <w:instrText xml:space="preserve"> PAGEREF _Toc231917869 \h </w:instrText>
             </w:r>
             <w:r>
               <w:rPr>
@@ -3088,7 +3088,7 @@
               <w14:ligatures w14:val="standardContextual"/>
             </w:rPr>
           </w:pPr>
-          <w:hyperlink w:anchor="_Toc231917367" w:history="1">
+          <w:hyperlink w:anchor="_Toc231917870" w:history="1">
             <w:r>
               <w:rPr>
                 <w:rStyle w:val="ab"/>
@@ -3115,7 +3115,7 @@
                 <w:noProof/>
                 <w:webHidden/>
               </w:rPr>
-              <w:instrText xml:space="preserve"> PAGEREF _Toc231917367 \h </w:instrText>
+              <w:instrText xml:space="preserve"> PAGEREF _Toc231917870 \h </w:instrText>
             </w:r>
             <w:r>
               <w:rPr>
@@ -3159,7 +3159,7 @@
               <w14:ligatures w14:val="standardContextual"/>
             </w:rPr>
           </w:pPr>
-          <w:hyperlink w:anchor="_Toc231917368" w:history="1">
+          <w:hyperlink w:anchor="_Toc231917871" w:history="1">
             <w:r>
               <w:rPr>
                 <w:rStyle w:val="ab"/>
@@ -3186,7 +3186,7 @@
                 <w:noProof/>
                 <w:webHidden/>
               </w:rPr>
-              <w:instrText xml:space="preserve"> PAGEREF _Toc231917368 \h </w:instrText>
+              <w:instrText xml:space="preserve"> PAGEREF _Toc231917871 \h </w:instrText>
             </w:r>
             <w:r>
               <w:rPr>
@@ -3230,7 +3230,7 @@
               <w14:ligatures w14:val="standardContextual"/>
             </w:rPr>
           </w:pPr>
-          <w:hyperlink w:anchor="_Toc231917369" w:history="1">
+          <w:hyperlink w:anchor="_Toc231917872" w:history="1">
             <w:r>
               <w:rPr>
                 <w:rStyle w:val="ab"/>
@@ -3295,7 +3295,7 @@
                 <w:noProof/>
                 <w:webHidden/>
               </w:rPr>
-              <w:instrText xml:space="preserve"> PAGEREF _Toc231917369 \h </w:instrText>
+              <w:instrText xml:space="preserve"> PAGEREF _Toc231917872 \h </w:instrText>
             </w:r>
             <w:r>
               <w:rPr>
@@ -3339,7 +3339,7 @@
               <w14:ligatures w14:val="standardContextual"/>
             </w:rPr>
           </w:pPr>
-          <w:hyperlink w:anchor="_Toc231917370" w:history="1">
+          <w:hyperlink w:anchor="_Toc231917873" w:history="1">
             <w:r>
               <w:rPr>
                 <w:rStyle w:val="ab"/>
@@ -3404,7 +3404,7 @@
                 <w:noProof/>
                 <w:webHidden/>
               </w:rPr>
-              <w:instrText xml:space="preserve"> PAGEREF _Toc231917370 \h </w:instrText>
+              <w:instrText xml:space="preserve"> PAGEREF _Toc231917873 \h </w:instrText>
             </w:r>
             <w:r>
               <w:rPr>
@@ -3448,7 +3448,7 @@
               <w14:ligatures w14:val="standardContextual"/>
             </w:rPr>
           </w:pPr>
-          <w:hyperlink w:anchor="_Toc231917371" w:history="1">
+          <w:hyperlink w:anchor="_Toc231917874" w:history="1">
             <w:r>
               <w:rPr>
                 <w:rStyle w:val="ab"/>
@@ -3513,7 +3513,7 @@
                 <w:noProof/>
                 <w:webHidden/>
               </w:rPr>
-              <w:instrText xml:space="preserve"> PAGEREF _Toc231917371 \h </w:instrText>
+              <w:instrText xml:space="preserve"> PAGEREF _Toc231917874 \h </w:instrText>
             </w:r>
             <w:r>
               <w:rPr>
@@ -3557,7 +3557,7 @@
               <w14:ligatures w14:val="standardContextual"/>
             </w:rPr>
           </w:pPr>
-          <w:hyperlink w:anchor="_Toc231917372" w:history="1">
+          <w:hyperlink w:anchor="_Toc231917875" w:history="1">
             <w:r>
               <w:rPr>
                 <w:rStyle w:val="ab"/>
@@ -3704,7 +3704,7 @@
                 <w:noProof/>
                 <w:webHidden/>
               </w:rPr>
-              <w:instrText xml:space="preserve"> PAGEREF _Toc231917372 \h </w:instrText>
+              <w:instrText xml:space="preserve"> PAGEREF _Toc231917875 \h </w:instrText>
             </w:r>
             <w:r>
               <w:rPr>
@@ -3748,7 +3748,7 @@
               <w14:ligatures w14:val="standardContextual"/>
             </w:rPr>
           </w:pPr>
-          <w:hyperlink w:anchor="_Toc231917373" w:history="1">
+          <w:hyperlink w:anchor="_Toc231917876" w:history="1">
             <w:r>
               <w:rPr>
                 <w:rStyle w:val="ab"/>
@@ -3873,7 +3873,7 @@
                 <w:noProof/>
                 <w:webHidden/>
               </w:rPr>
-              <w:instrText xml:space="preserve"> PAGEREF _Toc231917373 \h </w:instrText>
+              <w:instrText xml:space="preserve"> PAGEREF _Toc231917876 \h </w:instrText>
             </w:r>
             <w:r>
               <w:rPr>
@@ -3930,7 +3930,7 @@
       </w:pPr>
       <w:bookmarkStart w:id="0" w:name="_Toc101357288"/>
       <w:bookmarkStart w:id="1" w:name="_Toc101716161"/>
-      <w:bookmarkStart w:id="2" w:name="_Toc231917331"/>
+      <w:bookmarkStart w:id="2" w:name="_Toc231917834"/>
       <w:r>
         <w:lastRenderedPageBreak/>
         <w:t>Список сокращений</w:t>
@@ -4010,7 +4010,7 @@
           <w:numId w:val="0"/>
         </w:numPr>
       </w:pPr>
-      <w:bookmarkStart w:id="3" w:name="_Toc231917332"/>
+      <w:bookmarkStart w:id="3" w:name="_Toc231917835"/>
       <w:r>
         <w:lastRenderedPageBreak/>
         <w:t>Введение</w:t>
@@ -4689,7 +4689,7 @@
       <w:pPr>
         <w:pStyle w:val="10"/>
       </w:pPr>
-      <w:bookmarkStart w:id="4" w:name="_Toc231917333"/>
+      <w:bookmarkStart w:id="4" w:name="_Toc231917836"/>
       <w:r>
         <w:lastRenderedPageBreak/>
         <w:t>Теоретические основы неточного поиска в Базах данных</w:t>
@@ -4700,7 +4700,7 @@
       <w:pPr>
         <w:pStyle w:val="20"/>
       </w:pPr>
-      <w:bookmarkStart w:id="5" w:name="_Toc231917334"/>
+      <w:bookmarkStart w:id="5" w:name="_Toc231917837"/>
       <w:r>
         <w:t>Понятие и виды поиска в Базах данных</w:t>
       </w:r>
@@ -6790,7 +6790,7 @@
       <w:pPr>
         <w:pStyle w:val="20"/>
       </w:pPr>
-      <w:bookmarkStart w:id="6" w:name="_Toc231917335"/>
+      <w:bookmarkStart w:id="6" w:name="_Toc231917838"/>
       <w:r>
         <w:lastRenderedPageBreak/>
         <w:t>Проблемы точного поиска по числовым данным</w:t>
@@ -10116,7 +10116,7 @@
       <w:pPr>
         <w:pStyle w:val="20"/>
       </w:pPr>
-      <w:bookmarkStart w:id="7" w:name="_Toc231917336"/>
+      <w:bookmarkStart w:id="7" w:name="_Toc231917839"/>
       <w:r>
         <w:t>Методы неточного поиска</w:t>
       </w:r>
@@ -12801,7 +12801,7 @@
       <w:pPr>
         <w:pStyle w:val="20"/>
       </w:pPr>
-      <w:bookmarkStart w:id="8" w:name="_Toc231917337"/>
+      <w:bookmarkStart w:id="8" w:name="_Toc231917840"/>
       <w:r>
         <w:t>Особенности работы с числовыми данными</w:t>
       </w:r>
@@ -12964,7 +12964,7 @@
       <w:pPr>
         <w:pStyle w:val="20"/>
       </w:pPr>
-      <w:bookmarkStart w:id="9" w:name="_Toc231917338"/>
+      <w:bookmarkStart w:id="9" w:name="_Toc231917841"/>
       <w:r>
         <w:lastRenderedPageBreak/>
         <w:t>Обзор методов ускорения поиска</w:t>
@@ -13128,7 +13128,7 @@
       <w:pPr>
         <w:pStyle w:val="20"/>
       </w:pPr>
-      <w:bookmarkStart w:id="10" w:name="_Toc231917339"/>
+      <w:bookmarkStart w:id="10" w:name="_Toc231917842"/>
       <w:r>
         <w:t>Анализ предметной области</w:t>
       </w:r>
@@ -13269,7 +13269,7 @@
       <w:pPr>
         <w:pStyle w:val="10"/>
       </w:pPr>
-      <w:bookmarkStart w:id="11" w:name="_Toc231917340"/>
+      <w:bookmarkStart w:id="11" w:name="_Toc231917843"/>
       <w:r>
         <w:lastRenderedPageBreak/>
         <w:t>Разработка методов неточного поиска по числовым данным</w:t>
@@ -13285,7 +13285,7 @@
       <w:pPr>
         <w:pStyle w:val="20"/>
       </w:pPr>
-      <w:bookmarkStart w:id="12" w:name="_Toc231917341"/>
+      <w:bookmarkStart w:id="12" w:name="_Toc231917844"/>
       <w:r>
         <w:t>Постановка задачи</w:t>
       </w:r>
@@ -13980,7 +13980,7 @@
       <w:pPr>
         <w:pStyle w:val="20"/>
       </w:pPr>
-      <w:bookmarkStart w:id="13" w:name="_Toc231917342"/>
+      <w:bookmarkStart w:id="13" w:name="_Toc231917845"/>
       <w:r>
         <w:t>Вероятностная модель оценки</w:t>
       </w:r>
@@ -15700,7 +15700,7 @@
       <w:pPr>
         <w:pStyle w:val="20"/>
       </w:pPr>
-      <w:bookmarkStart w:id="14" w:name="_Toc231917343"/>
+      <w:bookmarkStart w:id="14" w:name="_Toc231917846"/>
       <w:r>
         <w:t>Метод интервальной группировки данных</w:t>
       </w:r>
@@ -15900,7 +15900,7 @@
       <w:pPr>
         <w:pStyle w:val="20"/>
       </w:pPr>
-      <w:bookmarkStart w:id="15" w:name="_Toc231917344"/>
+      <w:bookmarkStart w:id="15" w:name="_Toc231917847"/>
       <w:r>
         <w:t xml:space="preserve">Метод </w:t>
       </w:r>
@@ -16188,7 +16188,7 @@
       <w:pPr>
         <w:pStyle w:val="20"/>
       </w:pPr>
-      <w:bookmarkStart w:id="16" w:name="_Toc231917345"/>
+      <w:bookmarkStart w:id="16" w:name="_Toc231917848"/>
       <w:r>
         <w:lastRenderedPageBreak/>
         <w:t>Анализ вычислительной сложности</w:t>
@@ -16626,7 +16626,7 @@
       <w:pPr>
         <w:pStyle w:val="20"/>
       </w:pPr>
-      <w:bookmarkStart w:id="17" w:name="_Toc231917346"/>
+      <w:bookmarkStart w:id="17" w:name="_Toc231917849"/>
       <w:r>
         <w:t>Сравнение методов</w:t>
       </w:r>
@@ -17362,9 +17362,9 @@
       <w:pPr>
         <w:pStyle w:val="20"/>
       </w:pPr>
-      <w:bookmarkStart w:id="18" w:name="_Toc231917347"/>
-      <w:r>
-        <w:t>Применение метода в задачах кредитного скоринга [18; 19]</w:t>
+      <w:bookmarkStart w:id="18" w:name="_Toc231917850"/>
+      <w:r>
+        <w:t>Применение метода в задачах кредитного скоринга</w:t>
       </w:r>
       <w:bookmarkEnd w:id="18"/>
     </w:p>
@@ -17379,7 +17379,7 @@
         <w:rPr>
           <w:lang w:eastAsia="ru-RU"/>
         </w:rPr>
-        <w:t>Кредитный скоринг является одной из прикладных областей, в которой задача неточного поиска по числовым данным имеет практическую значимость. При оценке заемщика банк или аналитическая система редко работает с полностью уникальными и изолированными значениями. Обычно требуется сопоставить новую заявку с уже имеющимися профилями клиентов, определить степень близости между ними и оценить, к какой группе риска может относиться рассматриваемый заемщик.</w:t>
+        <w:t>Кредитный скоринг является одной из прикладных областей, в которой задача неточного поиска по числовым данным имеет практическую значимость. При оценке заемщика банк или аналитическая система редко работает с полностью уникальными и изолированными значениями. Обычно требуется сопоставить новую заявку с уже имеющимися профилями клиентов, определить степень близости между ними и оценить, к какой группе риска может относиться рассматриваемый заемщик [18; 19].</w:t>
       </w:r>
     </w:p>
     <w:p>
@@ -17561,7 +17561,7 @@
       <w:pPr>
         <w:pStyle w:val="10"/>
       </w:pPr>
-      <w:bookmarkStart w:id="19" w:name="_Toc231917348"/>
+      <w:bookmarkStart w:id="19" w:name="_Toc231917851"/>
       <w:r>
         <w:t>Программная реализация и экспериментальное исследование</w:t>
       </w:r>
@@ -17574,7 +17574,7 @@
       <w:pPr>
         <w:pStyle w:val="20"/>
       </w:pPr>
-      <w:bookmarkStart w:id="20" w:name="_Toc231917349"/>
+      <w:bookmarkStart w:id="20" w:name="_Toc231917852"/>
       <w:r>
         <w:t>Выбор инструментов и технологий</w:t>
       </w:r>
@@ -18085,7 +18085,7 @@
       <w:pPr>
         <w:pStyle w:val="20"/>
       </w:pPr>
-      <w:bookmarkStart w:id="21" w:name="_Toc231917350"/>
+      <w:bookmarkStart w:id="21" w:name="_Toc231917853"/>
       <w:r>
         <w:t>Описание структуры базы данных</w:t>
       </w:r>
@@ -20977,7 +20977,7 @@
       <w:pPr>
         <w:pStyle w:val="20"/>
       </w:pPr>
-      <w:bookmarkStart w:id="22" w:name="_Toc231917351"/>
+      <w:bookmarkStart w:id="22" w:name="_Toc231917854"/>
       <w:r>
         <w:t>Описание используемых датасетов</w:t>
       </w:r>
@@ -21449,7 +21449,7 @@
       <w:pPr>
         <w:pStyle w:val="20"/>
       </w:pPr>
-      <w:bookmarkStart w:id="23" w:name="_Toc231917352"/>
+      <w:bookmarkStart w:id="23" w:name="_Toc231917855"/>
       <w:r>
         <w:t>Реализация алгоритма</w:t>
       </w:r>
@@ -21535,7 +21535,7 @@
       <w:pPr>
         <w:pStyle w:val="20"/>
       </w:pPr>
-      <w:bookmarkStart w:id="24" w:name="_Toc231917353"/>
+      <w:bookmarkStart w:id="24" w:name="_Toc231917856"/>
       <w:r>
         <w:lastRenderedPageBreak/>
         <w:t>Проведение экспериментов</w:t>
@@ -22228,7 +22228,7 @@
       <w:pPr>
         <w:pStyle w:val="20"/>
       </w:pPr>
-      <w:bookmarkStart w:id="25" w:name="_Toc231917354"/>
+      <w:bookmarkStart w:id="25" w:name="_Toc231917857"/>
       <w:r>
         <w:t>Анализ результат</w:t>
       </w:r>
@@ -22355,7 +22355,7 @@
       <w:pPr>
         <w:pStyle w:val="20"/>
       </w:pPr>
-      <w:bookmarkStart w:id="26" w:name="_Toc231917355"/>
+      <w:bookmarkStart w:id="26" w:name="_Toc231917858"/>
       <w:r>
         <w:t>Сравнение с классическими методами поиска</w:t>
       </w:r>
@@ -22497,7 +22497,7 @@
           <w:numId w:val="0"/>
         </w:numPr>
       </w:pPr>
-      <w:bookmarkStart w:id="27" w:name="_Toc231917356"/>
+      <w:bookmarkStart w:id="27" w:name="_Toc231917859"/>
       <w:r>
         <w:lastRenderedPageBreak/>
         <w:t>Заключение</w:t>
@@ -22570,7 +22570,7 @@
           <w:numId w:val="0"/>
         </w:numPr>
       </w:pPr>
-      <w:bookmarkStart w:id="28" w:name="_Toc231917357"/>
+      <w:bookmarkStart w:id="28" w:name="_Toc231917860"/>
       <w:r>
         <w:lastRenderedPageBreak/>
         <w:t>Источники</w:t>
@@ -22788,7 +22788,7 @@
           <w:numId w:val="0"/>
         </w:numPr>
       </w:pPr>
-      <w:bookmarkStart w:id="29" w:name="_Toc231917358"/>
+      <w:bookmarkStart w:id="29" w:name="_Toc231917861"/>
       <w:r>
         <w:t>Приложение А</w:t>
       </w:r>
@@ -22802,7 +22802,7 @@
           <w:numId w:val="0"/>
         </w:numPr>
       </w:pPr>
-      <w:bookmarkStart w:id="30" w:name="_Toc231917359"/>
+      <w:bookmarkStart w:id="30" w:name="_Toc231917862"/>
       <w:r>
         <w:t>Фрагменты программной реализации</w:t>
       </w:r>
@@ -22832,7 +22832,7 @@
           <w:numId w:val="0"/>
         </w:numPr>
       </w:pPr>
-      <w:bookmarkStart w:id="31" w:name="_Toc231917360"/>
+      <w:bookmarkStart w:id="31" w:name="_Toc231917863"/>
       <w:r>
         <w:t>Листинг А.1 - Запуск графического приложения</w:t>
       </w:r>
@@ -24375,7 +24375,7 @@
           <w:numId w:val="0"/>
         </w:numPr>
       </w:pPr>
-      <w:bookmarkStart w:id="32" w:name="_Toc231917361"/>
+      <w:bookmarkStart w:id="32" w:name="_Toc231917864"/>
       <w:r>
         <w:t>Листинг А.2 - Базовая структура результата анализа</w:t>
       </w:r>
@@ -25698,7 +25698,7 @@
           <w:numId w:val="0"/>
         </w:numPr>
       </w:pPr>
-      <w:bookmarkStart w:id="33" w:name="_Toc231917362"/>
+      <w:bookmarkStart w:id="33" w:name="_Toc231917865"/>
       <w:r>
         <w:t>Листинг А.3 - Подготовка числовой выборки и квартильное квантование</w:t>
       </w:r>
@@ -26598,7 +26598,7 @@
           <w:numId w:val="0"/>
         </w:numPr>
       </w:pPr>
-      <w:bookmarkStart w:id="34" w:name="_Toc231917363"/>
+      <w:bookmarkStart w:id="34" w:name="_Toc231917866"/>
       <w:r>
         <w:t>Листинг А.4 - Формирование неточного запроса</w:t>
       </w:r>
@@ -27296,7 +27296,7 @@
           <w:numId w:val="0"/>
         </w:numPr>
       </w:pPr>
-      <w:bookmarkStart w:id="35" w:name="_Toc231917364"/>
+      <w:bookmarkStart w:id="35" w:name="_Toc231917867"/>
       <w:r>
         <w:t>Листинг А.5 - Базовый поиск полным перебором</w:t>
       </w:r>
@@ -27548,7 +27548,7 @@
           <w:numId w:val="0"/>
         </w:numPr>
       </w:pPr>
-      <w:bookmarkStart w:id="36" w:name="_Toc231917365"/>
+      <w:bookmarkStart w:id="36" w:name="_Toc231917868"/>
       <w:r>
         <w:t>Листинг А.6 - Квартильная и числовая фильтрация кандидатов</w:t>
       </w:r>
@@ -29001,7 +29001,7 @@
           <w:numId w:val="0"/>
         </w:numPr>
       </w:pPr>
-      <w:bookmarkStart w:id="37" w:name="_Toc231917366"/>
+      <w:bookmarkStart w:id="37" w:name="_Toc231917869"/>
       <w:r>
         <w:t>Листинг А.7 - Вероятностная оценка близости и ранжирование</w:t>
       </w:r>
@@ -29900,7 +29900,7 @@
           <w:numId w:val="0"/>
         </w:numPr>
       </w:pPr>
-      <w:bookmarkStart w:id="38" w:name="_Toc231917367"/>
+      <w:bookmarkStart w:id="38" w:name="_Toc231917870"/>
       <w:r>
         <w:t>Листинг А.8 - Расчет времени и итоговых экспериментальных метрик</w:t>
       </w:r>
@@ -30998,7 +30998,7 @@
           <w:numId w:val="0"/>
         </w:numPr>
       </w:pPr>
-      <w:bookmarkStart w:id="39" w:name="_Toc231917368"/>
+      <w:bookmarkStart w:id="39" w:name="_Toc231917871"/>
       <w:r>
         <w:t>Листинг А.9 - Общий сценарий выполнения анализа</w:t>
       </w:r>
@@ -32981,7 +32981,7 @@
           <w:lang w:val="en-US"/>
         </w:rPr>
       </w:pPr>
-      <w:bookmarkStart w:id="40" w:name="_Toc231917369"/>
+      <w:bookmarkStart w:id="40" w:name="_Toc231917872"/>
       <w:r>
         <w:t>Листинг</w:t>
       </w:r>
@@ -33438,7 +33438,7 @@
           <w:lang w:val="en-US"/>
         </w:rPr>
       </w:pPr>
-      <w:bookmarkStart w:id="41" w:name="_Toc231917370"/>
+      <w:bookmarkStart w:id="41" w:name="_Toc231917873"/>
       <w:r>
         <w:t>Листинг</w:t>
       </w:r>
@@ -34233,7 +34233,7 @@
           <w:lang w:val="en-US"/>
         </w:rPr>
       </w:pPr>
-      <w:bookmarkStart w:id="42" w:name="_Toc231917371"/>
+      <w:bookmarkStart w:id="42" w:name="_Toc231917874"/>
       <w:r>
         <w:t>Листинг</w:t>
       </w:r>
@@ -34725,7 +34725,7 @@
           <w:lang w:val="en-US"/>
         </w:rPr>
       </w:pPr>
-      <w:bookmarkStart w:id="43" w:name="_Toc231917372"/>
+      <w:bookmarkStart w:id="43" w:name="_Toc231917875"/>
       <w:r>
         <w:t>Листинг</w:t>
       </w:r>
@@ -38772,7 +38772,7 @@
           <w:lang w:val="en-US"/>
         </w:rPr>
       </w:pPr>
-      <w:bookmarkStart w:id="44" w:name="_Toc231917373"/>
+      <w:bookmarkStart w:id="44" w:name="_Toc231917876"/>
       <w:r>
         <w:t>Листинг</w:t>
       </w:r>

</xml_diff>